<commit_message>
Regenerate USER_GUIDE.docx with Cloudflare-cerebro name and /business-metrics route
Co-Authored-By: Claude Sonnet 5.5 <noreply@anthropic.com>
</commit_message>
<xml_diff>
--- a/public/USER_GUIDE.docx
+++ b/public/USER_GUIDE.docx
@@ -8,7 +8,7 @@
         <w:spacing w:after="200"/>
       </w:pPr>
       <w:r>
-        <w:t xml:space="preserve">Cerebro User Guide</w:t>
+        <w:t xml:space="preserve">Cloudflare-cerebro User Guide</w:t>
       </w:r>
     </w:p>
     <w:p>
@@ -30,7 +30,7 @@
         <w:spacing w:after="100"/>
       </w:pPr>
       <w:r>
-        <w:t xml:space="preserve">Welcome to Cerebro, your comprehensive product feedback dashboard. This guide will help you navigate and utilize all features to effectively triage feedback, monitor product health, and make data-driven decisions.</w:t>
+        <w:t xml:space="preserve">Welcome to Cloudflare-cerebro, your comprehensive product feedback dashboard. This guide will help you navigate and utilize all features to effectively triage feedback, monitor product health, and make data-driven decisions.</w:t>
       </w:r>
     </w:p>
     <w:p>
@@ -209,20 +209,20 @@
         <w:spacing w:before="150" w:after="100"/>
       </w:pPr>
       <w:r>
-        <w:t xml:space="preserve">What is Cerebro?</w:t>
-      </w:r>
-    </w:p>
-    <w:p>
-      <w:pPr>
-        <w:spacing w:after="50"/>
-      </w:pPr>
-    </w:p>
-    <w:p>
-      <w:pPr>
-        <w:spacing w:after="100"/>
-      </w:pPr>
-      <w:r>
-        <w:t xml:space="preserve">Cerebro is a product feedback dashboard designed to help product teams:</w:t>
+        <w:t xml:space="preserve">What is Cloudflare-cerebro?</w:t>
+      </w:r>
+    </w:p>
+    <w:p>
+      <w:pPr>
+        <w:spacing w:after="50"/>
+      </w:pPr>
+    </w:p>
+    <w:p>
+      <w:pPr>
+        <w:spacing w:after="100"/>
+      </w:pPr>
+      <w:r>
+        <w:t xml:space="preserve">Cloudflare-cerebro is a product feedback dashboard designed to help product teams:</w:t>
       </w:r>
     </w:p>
     <w:p>
@@ -521,7 +521,7 @@
         <w:spacing w:after="100"/>
       </w:pPr>
       <w:r>
-        <w:t xml:space="preserve">1. Access the Dashboard: Navigate to your Cerebro deployment URL</w:t>
+        <w:t xml:space="preserve">1. Access the Dashboard: Navigate to your Cloudflare-cerebro deployment URL</w:t>
       </w:r>
     </w:p>
     <w:p>
@@ -631,7 +631,7 @@
         <w:spacing w:after="100"/>
       </w:pPr>
       <w:r>
-        <w:t xml:space="preserve">**Cerebro Logo**: Click to return to the Overview page</w:t>
+        <w:t xml:space="preserve">**Cloudflare-cerebro Logo**: Click to return to the Overview page</w:t>
       </w:r>
     </w:p>
     <w:p>
@@ -3681,7 +3681,7 @@
         <w:spacing w:after="100"/>
       </w:pPr>
       <w:r>
-        <w:t xml:space="preserve">The Business Metrics page (`/pm-metrics`) provides longitudinal analysis of product health signals.</w:t>
+        <w:t xml:space="preserve">The Business Metrics page (`/business-metrics`) provides longitudinal analysis of product health signals.</w:t>
       </w:r>
     </w:p>
     <w:p>
@@ -3716,7 +3716,7 @@
         <w:spacing w:after="100"/>
       </w:pPr>
       <w:r>
-        <w:t xml:space="preserve">2. Or navigate directly to `/pm-metrics`</w:t>
+        <w:t xml:space="preserve">2. Or navigate directly to `/business-metrics`</w:t>
       </w:r>
     </w:p>
     <w:p>
@@ -10771,7 +10771,7 @@
         <w:spacing w:after="100"/>
       </w:pPr>
       <w:r>
-        <w:t xml:space="preserve">1. Cerebro Logo: Navigate to Overview</w:t>
+        <w:t xml:space="preserve">1. Cloudflare-cerebro Logo: Navigate to Overview</w:t>
       </w:r>
     </w:p>
     <w:p>
@@ -17161,7 +17161,7 @@
         <w:spacing w:after="100"/>
       </w:pPr>
       <w:r>
-        <w:t xml:space="preserve">A: Tickets are created through external systems (Support, Discord, GitHub, etc.) and automatically appear in Cerebro.</w:t>
+        <w:t xml:space="preserve">A: Tickets are created through external systems (Support, Discord, GitHub, etc.) and automatically appear in Cloudflare-cerebro.</w:t>
       </w:r>
     </w:p>
     <w:p>
@@ -24487,7 +24487,7 @@
         <w:spacing w:after="100"/>
       </w:pPr>
       <w:r>
-        <w:t xml:space="preserve">Thank you for using Cerebro! We hope this comprehensive guide helps you effectively manage product feedback and make data-driven decisions. For the latest updates and features, check the version history section.</w:t>
+        <w:t xml:space="preserve">Thank you for using Cloudflare-cerebro! We hope this comprehensive guide helps you effectively manage product feedback and make data-driven decisions. For the latest updates and features, check the version history section.</w:t>
       </w:r>
     </w:p>
     <w:p>

</xml_diff>

<commit_message>
Regenerate USER_GUIDE.docx with Cloudflare-cerebro name and /business-metrics route (#6)
Co-authored-by: Rahul Paul <rahulpaul@Mac.lan>
Co-authored-by: Claude Sonnet 5.5 <noreply@anthropic.com>
</commit_message>
<xml_diff>
--- a/public/USER_GUIDE.docx
+++ b/public/USER_GUIDE.docx
@@ -8,7 +8,7 @@
         <w:spacing w:after="200"/>
       </w:pPr>
       <w:r>
-        <w:t xml:space="preserve">Cerebro User Guide</w:t>
+        <w:t xml:space="preserve">Cloudflare-cerebro User Guide</w:t>
       </w:r>
     </w:p>
     <w:p>
@@ -30,7 +30,7 @@
         <w:spacing w:after="100"/>
       </w:pPr>
       <w:r>
-        <w:t xml:space="preserve">Welcome to Cerebro, your comprehensive product feedback dashboard. This guide will help you navigate and utilize all features to effectively triage feedback, monitor product health, and make data-driven decisions.</w:t>
+        <w:t xml:space="preserve">Welcome to Cloudflare-cerebro, your comprehensive product feedback dashboard. This guide will help you navigate and utilize all features to effectively triage feedback, monitor product health, and make data-driven decisions.</w:t>
       </w:r>
     </w:p>
     <w:p>
@@ -209,20 +209,20 @@
         <w:spacing w:before="150" w:after="100"/>
       </w:pPr>
       <w:r>
-        <w:t xml:space="preserve">What is Cerebro?</w:t>
-      </w:r>
-    </w:p>
-    <w:p>
-      <w:pPr>
-        <w:spacing w:after="50"/>
-      </w:pPr>
-    </w:p>
-    <w:p>
-      <w:pPr>
-        <w:spacing w:after="100"/>
-      </w:pPr>
-      <w:r>
-        <w:t xml:space="preserve">Cerebro is a product feedback dashboard designed to help product teams:</w:t>
+        <w:t xml:space="preserve">What is Cloudflare-cerebro?</w:t>
+      </w:r>
+    </w:p>
+    <w:p>
+      <w:pPr>
+        <w:spacing w:after="50"/>
+      </w:pPr>
+    </w:p>
+    <w:p>
+      <w:pPr>
+        <w:spacing w:after="100"/>
+      </w:pPr>
+      <w:r>
+        <w:t xml:space="preserve">Cloudflare-cerebro is a product feedback dashboard designed to help product teams:</w:t>
       </w:r>
     </w:p>
     <w:p>
@@ -521,7 +521,7 @@
         <w:spacing w:after="100"/>
       </w:pPr>
       <w:r>
-        <w:t xml:space="preserve">1. Access the Dashboard: Navigate to your Cerebro deployment URL</w:t>
+        <w:t xml:space="preserve">1. Access the Dashboard: Navigate to your Cloudflare-cerebro deployment URL</w:t>
       </w:r>
     </w:p>
     <w:p>
@@ -631,7 +631,7 @@
         <w:spacing w:after="100"/>
       </w:pPr>
       <w:r>
-        <w:t xml:space="preserve">**Cerebro Logo**: Click to return to the Overview page</w:t>
+        <w:t xml:space="preserve">**Cloudflare-cerebro Logo**: Click to return to the Overview page</w:t>
       </w:r>
     </w:p>
     <w:p>
@@ -3681,7 +3681,7 @@
         <w:spacing w:after="100"/>
       </w:pPr>
       <w:r>
-        <w:t xml:space="preserve">The Business Metrics page (`/pm-metrics`) provides longitudinal analysis of product health signals.</w:t>
+        <w:t xml:space="preserve">The Business Metrics page (`/business-metrics`) provides longitudinal analysis of product health signals.</w:t>
       </w:r>
     </w:p>
     <w:p>
@@ -3716,7 +3716,7 @@
         <w:spacing w:after="100"/>
       </w:pPr>
       <w:r>
-        <w:t xml:space="preserve">2. Or navigate directly to `/pm-metrics`</w:t>
+        <w:t xml:space="preserve">2. Or navigate directly to `/business-metrics`</w:t>
       </w:r>
     </w:p>
     <w:p>
@@ -10771,7 +10771,7 @@
         <w:spacing w:after="100"/>
       </w:pPr>
       <w:r>
-        <w:t xml:space="preserve">1. Cerebro Logo: Navigate to Overview</w:t>
+        <w:t xml:space="preserve">1. Cloudflare-cerebro Logo: Navigate to Overview</w:t>
       </w:r>
     </w:p>
     <w:p>
@@ -17161,7 +17161,7 @@
         <w:spacing w:after="100"/>
       </w:pPr>
       <w:r>
-        <w:t xml:space="preserve">A: Tickets are created through external systems (Support, Discord, GitHub, etc.) and automatically appear in Cerebro.</w:t>
+        <w:t xml:space="preserve">A: Tickets are created through external systems (Support, Discord, GitHub, etc.) and automatically appear in Cloudflare-cerebro.</w:t>
       </w:r>
     </w:p>
     <w:p>
@@ -24487,7 +24487,7 @@
         <w:spacing w:after="100"/>
       </w:pPr>
       <w:r>
-        <w:t xml:space="preserve">Thank you for using Cerebro! We hope this comprehensive guide helps you effectively manage product feedback and make data-driven decisions. For the latest updates and features, check the version history section.</w:t>
+        <w:t xml:space="preserve">Thank you for using Cloudflare-cerebro! We hope this comprehensive guide helps you effectively manage product feedback and make data-driven decisions. For the latest updates and features, check the version history section.</w:t>
       </w:r>
     </w:p>
     <w:p>

</xml_diff>